<commit_message>
Cap nhat phieu thuc hanh voi commit SHA chinh xac
</commit_message>
<xml_diff>
--- a/TuLeNhatLong_thuchanhbuoi05.docx
+++ b/TuLeNhatLong_thuchanhbuoi05.docx
@@ -214,7 +214,7 @@
           <w:p>
             <w:r>
               <w:rPr/>
-              <w:t xml:space="preserve">https://github.com/[chờ link repository]</w:t>
+              <w:t xml:space="preserve">[bạn cung cấp URL repository để điền vào đây]</w:t>
             </w:r>
           </w:p>
         </w:tc>
@@ -246,7 +246,7 @@
           <w:p>
             <w:r>
               <w:rPr/>
-              <w:t xml:space="preserve">[chờ sau khi push]</w:t>
+              <w:t xml:space="preserve">6eec32d54b8fc866021fd957b4c378c83ece4491</w:t>
             </w:r>
           </w:p>
         </w:tc>

</xml_diff>